<commit_message>
Prepare repository for GitHub upload
</commit_message>
<xml_diff>
--- a/자료/버티포트 수요조사 및 항로 분석.docx
+++ b/자료/버티포트 수요조사 및 항로 분석.docx
@@ -1096,6 +1096,43 @@
     </w:p>
     <w:p>
       <w:pPr>
+        <w:rPr>
+          <w:b/>
+          <w:bCs/>
+          <w:szCs w:val="22"/>
+        </w:rPr>
+      </w:pPr>
+    </w:p>
+    <w:p>
+      <w:pPr>
+        <w:rPr>
+          <w:b/>
+          <w:bCs/>
+          <w:szCs w:val="22"/>
+        </w:rPr>
+      </w:pPr>
+    </w:p>
+    <w:p>
+      <w:pPr>
+        <w:rPr>
+          <w:b/>
+          <w:bCs/>
+          <w:szCs w:val="22"/>
+        </w:rPr>
+      </w:pPr>
+    </w:p>
+    <w:p>
+      <w:pPr>
+        <w:rPr>
+          <w:rFonts w:hint="eastAsia"/>
+          <w:b/>
+          <w:bCs/>
+          <w:szCs w:val="22"/>
+        </w:rPr>
+      </w:pPr>
+    </w:p>
+    <w:p>
+      <w:pPr>
         <w:jc w:val="center"/>
         <w:rPr>
           <w:b/>
@@ -1113,6 +1150,7 @@
           <w:sz w:val="40"/>
           <w:szCs w:val="44"/>
         </w:rPr>
+        <w:lastRenderedPageBreak/>
         <w:t>버티포트</w:t>
       </w:r>
       <w:proofErr w:type="spellEnd"/>
@@ -1145,12 +1183,12 @@
           <w:szCs w:val="22"/>
         </w:rPr>
         <w:sectPr>
-          <w:headerReference w:type="even" r:id="rId7"/>
-          <w:headerReference w:type="default" r:id="rId8"/>
-          <w:footerReference w:type="even" r:id="rId9"/>
-          <w:footerReference w:type="default" r:id="rId10"/>
-          <w:headerReference w:type="first" r:id="rId11"/>
-          <w:footerReference w:type="first" r:id="rId12"/>
+          <w:headerReference w:type="even" r:id="rId8"/>
+          <w:headerReference w:type="default" r:id="rId9"/>
+          <w:footerReference w:type="even" r:id="rId10"/>
+          <w:footerReference w:type="default" r:id="rId11"/>
+          <w:headerReference w:type="first" r:id="rId12"/>
+          <w:footerReference w:type="first" r:id="rId13"/>
           <w:pgSz w:w="11906" w:h="16838"/>
           <w:pgMar w:top="1701" w:right="1440" w:bottom="1440" w:left="1440" w:header="851" w:footer="567" w:gutter="0"/>
           <w:cols w:space="425"/>
@@ -1189,22 +1227,7 @@
           <w:sz w:val="20"/>
           <w:szCs w:val="20"/>
         </w:rPr>
-        <w:t>2028년 상용화를 목표로 추진되고 있는 K-</w:t>
-      </w:r>
-      <w:r>
-        <w:rPr>
-          <w:sz w:val="20"/>
-          <w:szCs w:val="20"/>
-        </w:rPr>
-        <w:t xml:space="preserve">UAM Grand Challenge에는 현대자동차, 대한항공, SK텔레콤 등 다양한 기업들이 참여해 왔다. 그러나 기체 개발 지연, 사업성 검토의 </w:t>
-      </w:r>
-      <w:r>
-        <w:rPr>
-          <w:sz w:val="20"/>
-          <w:szCs w:val="20"/>
-        </w:rPr>
-        <w:lastRenderedPageBreak/>
-        <w:t xml:space="preserve">불확실성, UAM 운항 및 인프라 구축에 대한 명확한 기준 부족 등으로 인해 2026년 현재 일부 기업의 참여가 위축되고 있는 상황이다. </w:t>
+        <w:t xml:space="preserve">2028년 상용화를 목표로 추진되고 있는 K-UAM Grand Challenge에는 현대자동차, 대한항공, SK텔레콤 등 다양한 기업들이 참여해 왔다. 그러나 기체 개발 지연, 사업성 검토의 불확실성, UAM 운항 및 인프라 구축에 대한 명확한 기준 부족 등으로 인해 2026년 현재 일부 기업의 참여가 위축되고 있는 상황이다. </w:t>
       </w:r>
     </w:p>
     <w:p>
@@ -1350,7 +1373,14 @@
           <w:sz w:val="20"/>
           <w:szCs w:val="20"/>
         </w:rPr>
-        <w:t xml:space="preserve"> 아니라 중국, 유럽, 중동 등 여러 국가에서도 UAM 산업 생태계 조성을 위한 기술 개발과 제도 정비가 진행되고 있다. 대한민국 역시 K-UAM Grand Challenge를 중심으로 기체 안전성, 운항체계, 교통관리, </w:t>
+        <w:t xml:space="preserve"> 아니라 중국, 유럽, 중동 등 여러 국</w:t>
+      </w:r>
+      <w:r>
+        <w:rPr>
+          <w:sz w:val="20"/>
+          <w:szCs w:val="20"/>
+        </w:rPr>
+        <w:t xml:space="preserve">가에서도 UAM 산업 생태계 조성을 위한 기술 개발과 제도 정비가 진행되고 있다. 대한민국 역시 K-UAM Grand Challenge를 중심으로 기체 안전성, 운항체계, 교통관리, </w:t>
       </w:r>
       <w:proofErr w:type="spellStart"/>
       <w:r>
@@ -1398,14 +1428,7 @@
           <w:sz w:val="20"/>
           <w:szCs w:val="20"/>
         </w:rPr>
-        <w:t xml:space="preserve"> 입지 선정, 사업성 검토 등에서 불확실성이 크다. 특히 국내에서는 실증사업 참여 기업 일부가 사업 전략을 </w:t>
-      </w:r>
-      <w:r>
-        <w:rPr>
-          <w:sz w:val="20"/>
-          <w:szCs w:val="20"/>
-        </w:rPr>
-        <w:t xml:space="preserve">재조정하거나 참여를 축소하는 흐름이 나타나고 있으며, 이는 UAM 상용화 과정에서 기술적 검증뿐 아니라 수요 기반의 인프라 계획과 항로 설계가 중요함을 보여준다. 따라서 UAM의 실질적인 도입 가능성을 높이기 위해서는 단순한 기술 개발을 넘어, 어느 지역에 </w:t>
+        <w:t xml:space="preserve"> 입지 선정, 사업성 검토 등에서 불확실성이 크다. 특히 국내에서는 실증사업 참여 기업 일부가 사업 전략을 재조정하거나 참여를 축소하는 흐름이 나타나고 있으며, 이는 UAM 상용화 과정에서 기술적 검증뿐 아니라 수요 기반의 인프라 계획과 항로 설계가 중요함을 보여준다. 따라서 UAM의 실질적인 도입 가능성을 높이기 위해서는 단순한 기술 개발을 넘어, 어느 지역에 </w:t>
       </w:r>
       <w:proofErr w:type="spellStart"/>
       <w:r>
@@ -1575,6 +1598,7 @@
           <w:sz w:val="20"/>
           <w:szCs w:val="20"/>
         </w:rPr>
+        <w:lastRenderedPageBreak/>
         <w:t>UAM(Urban Air Mobility)</w:t>
       </w:r>
       <w:r>
@@ -1702,16 +1726,7 @@
           <w:sz w:val="20"/>
           <w:szCs w:val="20"/>
         </w:rPr>
-        <w:t>도심형 항공기가 이착륙하기 위한 기반시설(교통시설), 육상, 수상, 또는 건물옥상 등에 위치할 수 있으며 필요에 따라 정비 지원</w:t>
-      </w:r>
-      <w:r>
-        <w:rPr>
-          <w:rFonts w:hint="eastAsia"/>
-          <w:sz w:val="20"/>
-          <w:szCs w:val="20"/>
-        </w:rPr>
-        <w:lastRenderedPageBreak/>
-        <w:t>이나 승객 탑승, 하기, 환승 및 화물 적재, 적하 등을 위한 시설 등을 의미한다.</w:t>
+        <w:t>도심형 항공기가 이착륙하기 위한 기반시설(교통시설), 육상, 수상, 또는 건물옥상 등에 위치할 수 있으며 필요에 따라 정비 지원이나 승객 탑승, 하기, 환승 및 화물 적재, 적하 등을 위한 시설 등을 의미한다.</w:t>
       </w:r>
       <w:r>
         <w:rPr>
@@ -2174,7 +2189,15 @@
           <w:sz w:val="20"/>
           <w:szCs w:val="20"/>
         </w:rPr>
-        <w:t>이러한 문제점에 대응해, 한국관광공사에서 발행하는 관광 100선을 통해 서울 포함, 수도권 지역에 대한 인기 관광지를 알아보고자 한다.</w:t>
+        <w:t xml:space="preserve">이러한 문제점에 대응해, 한국관광공사에서 </w:t>
+      </w:r>
+      <w:r>
+        <w:rPr>
+          <w:rFonts w:hint="eastAsia"/>
+          <w:sz w:val="20"/>
+          <w:szCs w:val="20"/>
+        </w:rPr>
+        <w:t>발행하는 관광 100선을 통해 서울 포함, 수도권 지역에 대한 인기 관광지를 알아보고자 한다.</w:t>
       </w:r>
     </w:p>
     <w:p>
@@ -2205,7 +2228,7 @@
                     <pic:cNvPicPr/>
                   </pic:nvPicPr>
                   <pic:blipFill>
-                    <a:blip r:embed="rId13"/>
+                    <a:blip r:embed="rId14"/>
                     <a:stretch>
                       <a:fillRect/>
                     </a:stretch>
@@ -2392,7 +2415,7 @@
                     <pic:cNvPicPr/>
                   </pic:nvPicPr>
                   <pic:blipFill>
-                    <a:blip r:embed="rId14"/>
+                    <a:blip r:embed="rId15"/>
                     <a:stretch>
                       <a:fillRect/>
                     </a:stretch>
@@ -2456,6 +2479,7 @@
           <w:sz w:val="21"/>
           <w:szCs w:val="21"/>
         </w:rPr>
+        <w:lastRenderedPageBreak/>
         <w:t>3.1.3 MICE 산업</w:t>
       </w:r>
     </w:p>
@@ -2596,7 +2620,6 @@
                 <w:sz w:val="20"/>
                 <w:szCs w:val="20"/>
               </w:rPr>
-              <w:lastRenderedPageBreak/>
               <w:t>2</w:t>
             </w:r>
           </w:p>
@@ -2780,7 +2803,7 @@
                     <pic:cNvPicPr/>
                   </pic:nvPicPr>
                   <pic:blipFill>
-                    <a:blip r:embed="rId15"/>
+                    <a:blip r:embed="rId16"/>
                     <a:stretch>
                       <a:fillRect/>
                     </a:stretch>
@@ -3323,7 +3346,7 @@
                     <pic:cNvPicPr/>
                   </pic:nvPicPr>
                   <pic:blipFill>
-                    <a:blip r:embed="rId16"/>
+                    <a:blip r:embed="rId17"/>
                     <a:stretch>
                       <a:fillRect/>
                     </a:stretch>
@@ -3497,6 +3520,7 @@
           <w:sz w:val="20"/>
           <w:szCs w:val="20"/>
         </w:rPr>
+        <w:lastRenderedPageBreak/>
         <w:drawing>
           <wp:inline distT="0" distB="0" distL="0" distR="0" wp14:anchorId="7311CA33" wp14:editId="3651B91C">
             <wp:extent cx="2730500" cy="2252345"/>
@@ -3513,7 +3537,7 @@
                     <pic:cNvPicPr/>
                   </pic:nvPicPr>
                   <pic:blipFill>
-                    <a:blip r:embed="rId17"/>
+                    <a:blip r:embed="rId18"/>
                     <a:stretch>
                       <a:fillRect/>
                     </a:stretch>
@@ -3572,7 +3596,6 @@
         <w:rPr>
           <w:noProof/>
         </w:rPr>
-        <w:lastRenderedPageBreak/>
         <w:drawing>
           <wp:inline distT="0" distB="0" distL="0" distR="0" wp14:anchorId="75547D11" wp14:editId="7FAC24CF">
             <wp:extent cx="2627630" cy="2186433"/>
@@ -3589,7 +3612,7 @@
                     <pic:cNvPicPr/>
                   </pic:nvPicPr>
                   <pic:blipFill>
-                    <a:blip r:embed="rId18"/>
+                    <a:blip r:embed="rId19"/>
                     <a:stretch>
                       <a:fillRect/>
                     </a:stretch>
@@ -4150,7 +4173,14 @@
                 <w:sz w:val="18"/>
                 <w:szCs w:val="18"/>
               </w:rPr>
-              <w:t>도착지 기준 2 km 전부터 하강 및 감속 수행</w:t>
+              <w:t xml:space="preserve">도착지 기준 2 km 전부터 하강 </w:t>
+            </w:r>
+            <w:r>
+              <w:rPr>
+                <w:sz w:val="18"/>
+                <w:szCs w:val="18"/>
+              </w:rPr>
+              <w:t>및 감속 수행</w:t>
             </w:r>
           </w:p>
         </w:tc>
@@ -5897,7 +5927,6 @@
           <w:sz w:val="20"/>
           <w:szCs w:val="20"/>
         </w:rPr>
-        <w:lastRenderedPageBreak/>
         <w:t>이에 따라 상승·가속 종료 시점의 속도는 다음과 같이 산정하였다.</w:t>
       </w:r>
     </w:p>
@@ -7657,14 +7686,7 @@
           <w:sz w:val="20"/>
           <w:szCs w:val="20"/>
         </w:rPr>
-        <w:t xml:space="preserve">하강·감속 단계에서는 하강 시작 속도에서 </w:t>
-      </w:r>
-      <w:r>
-        <w:rPr>
-          <w:sz w:val="20"/>
-          <w:szCs w:val="20"/>
-        </w:rPr>
-        <w:t xml:space="preserve">도착지 속도 0까지 선형적으로 감속한다고 가정하였다. 따라서 평균 하강속도는 </w:t>
+        <w:t xml:space="preserve">하강·감속 단계에서는 하강 시작 속도에서 도착지 속도 0까지 선형적으로 감속한다고 가정하였다. 따라서 평균 하강속도는 </w:t>
       </w:r>
       <m:oMath>
         <m:sSub>
@@ -8330,7 +8352,7 @@
                     </pic:cNvPicPr>
                   </pic:nvPicPr>
                   <pic:blipFill rotWithShape="1">
-                    <a:blip r:embed="rId19" cstate="print">
+                    <a:blip r:embed="rId20" cstate="print">
                       <a:extLst>
                         <a:ext uri="{28A0092B-C50C-407E-A947-70E740481C1C}">
                           <a14:useLocalDpi xmlns:a14="http://schemas.microsoft.com/office/drawing/2010/main" val="0"/>
@@ -8387,6 +8409,7 @@
           <w:sz w:val="20"/>
           <w:szCs w:val="20"/>
         </w:rPr>
+        <w:lastRenderedPageBreak/>
         <w:t>&lt;그림 6-4&gt; UAM 기체의 운영방식</w:t>
       </w:r>
     </w:p>
@@ -8477,15 +8500,7 @@
           <w:sz w:val="20"/>
           <w:szCs w:val="20"/>
         </w:rPr>
-        <w:t xml:space="preserve"> 후보지를 node로 설정하고, 후보지 간 이동시간 또는 이동거리</w:t>
-      </w:r>
-      <w:r>
-        <w:rPr>
-          <w:sz w:val="20"/>
-          <w:szCs w:val="20"/>
-        </w:rPr>
-        <w:lastRenderedPageBreak/>
-        <w:t xml:space="preserve">를 Cost로 정의하였다. 또한 특정 조건을 만족하지 않는 node나 경로에는 penalty Cost를 부여하여, 단순 최단거리 기반의 경로가 아닌 UAM 운항 목적에 적합한 경로가 도출되도록 하였다. 이를 통해 전체 Cost가 최소화되는 방향으로 </w:t>
+        <w:t xml:space="preserve"> 후보지를 node로 설정하고, 후보지 간 이동시간 또는 이동거리를 Cost로 정의하였다. 또한 특정 조건을 만족하지 않는 node나 경로에는 penalty Cost를 부여하여, 단순 최단거리 기반의 경로가 아닌 UAM 운항 목적에 적합한 경로가 도출되도록 하였다. 이를 통해 전체 Cost가 최소화되는 방향으로 </w:t>
       </w:r>
       <w:proofErr w:type="spellStart"/>
       <w:r>
@@ -9036,7 +9051,15 @@
           <w:sz w:val="20"/>
           <w:szCs w:val="20"/>
         </w:rPr>
-        <w:t xml:space="preserve"> 따라서, 기체가 최대한 많은 node를 방문할 수 있도록 미 방문 node들에 대한 penalty를 </w:t>
+        <w:t xml:space="preserve"> 따라서, </w:t>
+      </w:r>
+      <w:r>
+        <w:rPr>
+          <w:rFonts w:hint="eastAsia"/>
+          <w:sz w:val="20"/>
+          <w:szCs w:val="20"/>
+        </w:rPr>
+        <w:t xml:space="preserve">기체가 최대한 많은 node를 방문할 수 있도록 미 방문 node들에 대한 penalty를 </w:t>
       </w:r>
       <w:r>
         <w:rPr>
@@ -9133,15 +9156,7 @@
           <w:sz w:val="20"/>
           <w:szCs w:val="20"/>
         </w:rPr>
-        <w:t xml:space="preserve"> 높은 node를 우선으로 방문토록 하게 한다. (물론, 조절</w:t>
-      </w:r>
-      <w:r>
-        <w:rPr>
-          <w:rFonts w:hint="eastAsia"/>
-          <w:sz w:val="20"/>
-          <w:szCs w:val="20"/>
-        </w:rPr>
-        <w:t>이 가능)</w:t>
+        <w:t xml:space="preserve"> 높은 node를 우선으로 방문토록 하게 한다. (물론, 조절이 가능)</w:t>
       </w:r>
     </w:p>
     <w:p>
@@ -9390,7 +9405,16 @@
           <w:sz w:val="20"/>
           <w:szCs w:val="21"/>
         </w:rPr>
-        <w:t xml:space="preserve">모든 기체에는 최대 운항거리가 존재한다. 물론, 중간마다 충전을 할 수 있겠으나 UAM에서 사용되는 주된 기체인 eVTOL의 경우 충전시간이 매우 오래 걸리고 각 </w:t>
+        <w:t>모든 기체에는 최대 운항거리가 존재한다. 물론, 중간마다 충전을 할 수 있겠으나 UAM</w:t>
+      </w:r>
+      <w:r>
+        <w:rPr>
+          <w:rFonts w:hint="eastAsia"/>
+          <w:sz w:val="20"/>
+          <w:szCs w:val="21"/>
+        </w:rPr>
+        <w:lastRenderedPageBreak/>
+        <w:t xml:space="preserve">에서 사용되는 주된 기체인 eVTOL의 경우 충전시간이 매우 오래 걸리고 각 </w:t>
       </w:r>
       <w:proofErr w:type="spellStart"/>
       <w:r>
@@ -9504,7 +9528,6 @@
           <w:sz w:val="20"/>
           <w:szCs w:val="21"/>
         </w:rPr>
-        <w:lastRenderedPageBreak/>
         <w:t xml:space="preserve"> 이에 본 연구에서는 후보지 간 거리가 12 km 이내인 경우 공간적으로 유사한 수요권을 공유한다고 판단하고, 해당 후보지들이 동시에 경로에 포함되지 않도록 근접 노드 기반 공간 중복 제약을 부여하였다. 일반 후보지 간 거리가 12 km 이하인 경우 두 후보지 중 최대 하나만 방문할 수 있도록 하였으며, depot과 12 km 이내에 위치한 후보지는 출발지와의 공간적 중복성이 크다고 판단하여 방문 대상에서 제외하였다.</w:t>
       </w:r>
     </w:p>
@@ -11901,6 +11924,7 @@
           <w:sz w:val="20"/>
           <w:szCs w:val="20"/>
         </w:rPr>
+        <w:lastRenderedPageBreak/>
         <w:t>위의 내용을 전부 고려해 평가항목 집합을 다음과 같이 정의했다.</w:t>
       </w:r>
     </w:p>
@@ -12142,12 +12166,21 @@
           <m:t>k</m:t>
         </m:r>
       </m:oMath>
-      <w:r>
-        <w:rPr>
-          <w:sz w:val="20"/>
-          <w:szCs w:val="20"/>
-        </w:rPr>
-        <w:t xml:space="preserve">에 대한 </w:t>
+      <w:proofErr w:type="spellStart"/>
+      <w:r>
+        <w:rPr>
+          <w:sz w:val="20"/>
+          <w:szCs w:val="20"/>
+        </w:rPr>
+        <w:t>에</w:t>
+      </w:r>
+      <w:proofErr w:type="spellEnd"/>
+      <w:r>
+        <w:rPr>
+          <w:sz w:val="20"/>
+          <w:szCs w:val="20"/>
+        </w:rPr>
+        <w:t xml:space="preserve"> 대한 </w:t>
       </w:r>
       <w:proofErr w:type="spellStart"/>
       <w:r>
@@ -13072,7 +13105,14 @@
           <w:sz w:val="20"/>
           <w:szCs w:val="20"/>
         </w:rPr>
-        <w:t xml:space="preserve"> 평가항목 점수와 정규화 가중치의 가중합으로 산정하였다.</w:t>
+        <w:t xml:space="preserve"> 평가항목 점수와 정규화 가중치의 가중</w:t>
+      </w:r>
+      <w:r>
+        <w:rPr>
+          <w:sz w:val="20"/>
+          <w:szCs w:val="20"/>
+        </w:rPr>
+        <w:t>합으로 산정하였다.</w:t>
       </w:r>
     </w:p>
     <w:p>
@@ -13833,7 +13873,7 @@
                     <pic:cNvPicPr/>
                   </pic:nvPicPr>
                   <pic:blipFill>
-                    <a:blip r:embed="rId20"/>
+                    <a:blip r:embed="rId21"/>
                     <a:stretch>
                       <a:fillRect/>
                     </a:stretch>
@@ -14040,6 +14080,7 @@
           <w:sz w:val="18"/>
           <w:szCs w:val="18"/>
         </w:rPr>
+        <w:lastRenderedPageBreak/>
         <w:drawing>
           <wp:inline distT="0" distB="0" distL="0" distR="0" wp14:anchorId="0A6924CB" wp14:editId="454E390D">
             <wp:extent cx="2161309" cy="1956739"/>
@@ -14056,7 +14097,7 @@
                     <pic:cNvPicPr/>
                   </pic:nvPicPr>
                   <pic:blipFill>
-                    <a:blip r:embed="rId21"/>
+                    <a:blip r:embed="rId22"/>
                     <a:stretch>
                       <a:fillRect/>
                     </a:stretch>
@@ -14141,7 +14182,6 @@
           <w:sz w:val="20"/>
           <w:szCs w:val="20"/>
         </w:rPr>
-        <w:lastRenderedPageBreak/>
         <w:drawing>
           <wp:inline distT="0" distB="0" distL="0" distR="0" wp14:anchorId="24F0A763" wp14:editId="6508BADD">
             <wp:extent cx="2479248" cy="1892877"/>
@@ -14158,7 +14198,7 @@
                     <pic:cNvPicPr/>
                   </pic:nvPicPr>
                   <pic:blipFill>
-                    <a:blip r:embed="rId22"/>
+                    <a:blip r:embed="rId23"/>
                     <a:stretch>
                       <a:fillRect/>
                     </a:stretch>
@@ -14239,7 +14279,7 @@
                     <pic:cNvPicPr/>
                   </pic:nvPicPr>
                   <pic:blipFill>
-                    <a:blip r:embed="rId23"/>
+                    <a:blip r:embed="rId24"/>
                     <a:stretch>
                       <a:fillRect/>
                     </a:stretch>
@@ -14320,7 +14360,7 @@
                     <pic:cNvPicPr/>
                   </pic:nvPicPr>
                   <pic:blipFill>
-                    <a:blip r:embed="rId24"/>
+                    <a:blip r:embed="rId25"/>
                     <a:stretch>
                       <a:fillRect/>
                     </a:stretch>
@@ -14401,7 +14441,7 @@
                     <pic:cNvPicPr/>
                   </pic:nvPicPr>
                   <pic:blipFill>
-                    <a:blip r:embed="rId25"/>
+                    <a:blip r:embed="rId26"/>
                     <a:stretch>
                       <a:fillRect/>
                     </a:stretch>
@@ -14482,7 +14522,7 @@
                     <pic:cNvPicPr/>
                   </pic:nvPicPr>
                   <pic:blipFill>
-                    <a:blip r:embed="rId26"/>
+                    <a:blip r:embed="rId27"/>
                     <a:stretch>
                       <a:fillRect/>
                     </a:stretch>
@@ -14657,6 +14697,7 @@
           <w:sz w:val="20"/>
           <w:szCs w:val="20"/>
         </w:rPr>
+        <w:lastRenderedPageBreak/>
         <w:t>따라서, 이번에는 depot을 start와 end node를 설정해 강제적으로 특정 지역을 지날 수 있게 하는 직선형 노선을 생성해보고자 한다.</w:t>
       </w:r>
     </w:p>
@@ -14741,10 +14782,10 @@
       </w:pPr>
       <w:r>
         <w:rPr>
-          <w:sz w:val="20"/>
-          <w:szCs w:val="20"/>
-        </w:rPr>
-        <w:lastRenderedPageBreak/>
+          <w:noProof/>
+          <w:sz w:val="20"/>
+          <w:szCs w:val="20"/>
+        </w:rPr>
         <w:drawing>
           <wp:inline distT="0" distB="0" distL="0" distR="0" wp14:anchorId="55DED350" wp14:editId="72C66208">
             <wp:extent cx="2730500" cy="2164080"/>
@@ -14761,7 +14802,7 @@
                     <pic:cNvPicPr/>
                   </pic:nvPicPr>
                   <pic:blipFill>
-                    <a:blip r:embed="rId27"/>
+                    <a:blip r:embed="rId28"/>
                     <a:stretch>
                       <a:fillRect/>
                     </a:stretch>
@@ -14836,6 +14877,7 @@
       </w:pPr>
       <w:r>
         <w:rPr>
+          <w:noProof/>
           <w:sz w:val="20"/>
           <w:szCs w:val="20"/>
         </w:rPr>
@@ -14855,7 +14897,7 @@
                     <pic:cNvPicPr/>
                   </pic:nvPicPr>
                   <pic:blipFill>
-                    <a:blip r:embed="rId28"/>
+                    <a:blip r:embed="rId29"/>
                     <a:stretch>
                       <a:fillRect/>
                     </a:stretch>
@@ -14925,9 +14967,222 @@
       <w:pPr>
         <w:jc w:val="center"/>
         <w:rPr>
-          <w:rFonts w:hint="eastAsia"/>
-          <w:b/>
-          <w:bCs/>
+          <w:b/>
+          <w:bCs/>
+          <w:sz w:val="20"/>
+          <w:szCs w:val="20"/>
+        </w:rPr>
+      </w:pPr>
+    </w:p>
+    <w:p>
+      <w:pPr>
+        <w:numPr>
+          <w:ilvl w:val="0"/>
+          <w:numId w:val="7"/>
+        </w:numPr>
+        <w:ind w:firstLineChars="100" w:firstLine="220"/>
+        <w:rPr>
+          <w:b/>
+          <w:bCs/>
+          <w:szCs w:val="22"/>
+        </w:rPr>
+      </w:pPr>
+      <w:r>
+        <w:rPr>
+          <w:b/>
+          <w:bCs/>
+          <w:szCs w:val="22"/>
+        </w:rPr>
+        <w:t>결론</w:t>
+      </w:r>
+    </w:p>
+    <w:p>
+      <w:pPr>
+        <w:ind w:firstLineChars="100" w:firstLine="200"/>
+        <w:rPr>
+          <w:sz w:val="20"/>
+          <w:szCs w:val="20"/>
+        </w:rPr>
+      </w:pPr>
+      <w:r>
+        <w:rPr>
+          <w:sz w:val="20"/>
+          <w:szCs w:val="20"/>
+        </w:rPr>
+        <w:t xml:space="preserve">본 연구에서는 </w:t>
+      </w:r>
+      <w:proofErr w:type="spellStart"/>
+      <w:r>
+        <w:rPr>
+          <w:sz w:val="20"/>
+          <w:szCs w:val="20"/>
+        </w:rPr>
+        <w:t>버티포트</w:t>
+      </w:r>
+      <w:proofErr w:type="spellEnd"/>
+      <w:r>
+        <w:rPr>
+          <w:sz w:val="20"/>
+          <w:szCs w:val="20"/>
+        </w:rPr>
+        <w:t xml:space="preserve"> 후보지 선정 결과와 VRP 기반 경로 최적화 결과를 바탕으로 UAM 노선의 공간적 특성을 분석하였다. 분석 결과, 대부분의 조건에서 유사한 경로가 도출되는 것을 확인할 수 있었다. 이는 선정된 </w:t>
+      </w:r>
+      <w:proofErr w:type="spellStart"/>
+      <w:r>
+        <w:rPr>
+          <w:sz w:val="20"/>
+          <w:szCs w:val="20"/>
+        </w:rPr>
+        <w:t>버티포트</w:t>
+      </w:r>
+      <w:proofErr w:type="spellEnd"/>
+      <w:r>
+        <w:rPr>
+          <w:sz w:val="20"/>
+          <w:szCs w:val="20"/>
+        </w:rPr>
+        <w:t xml:space="preserve"> 후보지 간의 공간적 배치와 비용 조건이 경로 형성에 일정한 영향을 미치고 있음을 보여준다.</w:t>
+      </w:r>
+    </w:p>
+    <w:p>
+      <w:pPr>
+        <w:ind w:firstLineChars="100" w:firstLine="200"/>
+        <w:rPr>
+          <w:sz w:val="20"/>
+          <w:szCs w:val="20"/>
+        </w:rPr>
+      </w:pPr>
+      <w:r>
+        <w:rPr>
+          <w:sz w:val="20"/>
+          <w:szCs w:val="20"/>
+        </w:rPr>
+        <w:t xml:space="preserve">그러나 본 연구에서 도출된 경로는 안전성 요건을 충분히 반영하지 못했다는 한계가 있다. 또한 VRP 적용 과정과 </w:t>
+      </w:r>
+      <w:proofErr w:type="spellStart"/>
+      <w:r>
+        <w:rPr>
+          <w:sz w:val="20"/>
+          <w:szCs w:val="20"/>
+        </w:rPr>
+        <w:t>버티포트</w:t>
+      </w:r>
+      <w:proofErr w:type="spellEnd"/>
+      <w:r>
+        <w:rPr>
+          <w:sz w:val="20"/>
+          <w:szCs w:val="20"/>
+        </w:rPr>
+        <w:t xml:space="preserve"> 수요 분석에서 사용된 가중치는 탐색적 가정에 기반하여 설정되었기 때문에, 결과의 신뢰성을 높이기 위해서는 보다 객관적인 근거가 필요하다. 특히 본 연구에서는 여행객 밀집도와 실제 이동 수요를 충분히 반영하지 못하였으므로, 도출된 경로의 수요 타당성에는 일정한 한계가 존재한다.</w:t>
+      </w:r>
+    </w:p>
+    <w:p>
+      <w:pPr>
+        <w:ind w:firstLineChars="100" w:firstLine="200"/>
+        <w:rPr>
+          <w:sz w:val="20"/>
+          <w:szCs w:val="20"/>
+        </w:rPr>
+      </w:pPr>
+      <w:r>
+        <w:rPr>
+          <w:sz w:val="20"/>
+          <w:szCs w:val="20"/>
+        </w:rPr>
+        <w:t>따라서 향후 연구에서는 CBS 알고리즘 등 다중 경로 충돌 회피 기법을 활용하여 UAM 항로의 안전성을 검토할 필요가 있다. 또한 실제 수요 자료, 관광객 밀집도, 업무·상업 거점, 교통 접근성 자료 등 다양한 데이터를 추가적으로 확보하여 가중치 산정의 객관성을 높이고자 한다. 이를 바탕으로 단순한 최단 경로 또는 비용 최소화 경로를 넘어, 실제 이용 수요와 공간적 특성을 함께 고려한 현실성 있는 UAM 경로 선정 방안을 제시하고자 한다. 추가적으로 여행객 밀집 지역의 데이터가 확보될 경우, HUB to Spoke 형태의 노선 구조를 적용하여 관광 수요 기반 UAM 경로 생성 가능성도 검토할 예정이다.</w:t>
+      </w:r>
+    </w:p>
+    <w:p>
+      <w:pPr>
+        <w:ind w:firstLineChars="100" w:firstLine="200"/>
+        <w:rPr>
+          <w:sz w:val="20"/>
+          <w:szCs w:val="20"/>
+        </w:rPr>
+      </w:pPr>
+    </w:p>
+    <w:p>
+      <w:pPr>
+        <w:ind w:firstLineChars="100" w:firstLine="200"/>
+        <w:rPr>
+          <w:sz w:val="20"/>
+          <w:szCs w:val="20"/>
+        </w:rPr>
+      </w:pPr>
+    </w:p>
+    <w:p>
+      <w:pPr>
+        <w:ind w:firstLineChars="100" w:firstLine="200"/>
+        <w:rPr>
+          <w:sz w:val="20"/>
+          <w:szCs w:val="20"/>
+        </w:rPr>
+      </w:pPr>
+    </w:p>
+    <w:p>
+      <w:pPr>
+        <w:ind w:firstLineChars="100" w:firstLine="200"/>
+        <w:rPr>
+          <w:sz w:val="20"/>
+          <w:szCs w:val="20"/>
+        </w:rPr>
+      </w:pPr>
+    </w:p>
+    <w:p>
+      <w:pPr>
+        <w:ind w:firstLineChars="100" w:firstLine="200"/>
+        <w:rPr>
+          <w:sz w:val="20"/>
+          <w:szCs w:val="20"/>
+        </w:rPr>
+      </w:pPr>
+    </w:p>
+    <w:p>
+      <w:pPr>
+        <w:ind w:firstLineChars="100" w:firstLine="200"/>
+        <w:rPr>
+          <w:sz w:val="20"/>
+          <w:szCs w:val="20"/>
+        </w:rPr>
+      </w:pPr>
+    </w:p>
+    <w:p>
+      <w:pPr>
+        <w:ind w:firstLineChars="100" w:firstLine="200"/>
+        <w:rPr>
+          <w:sz w:val="20"/>
+          <w:szCs w:val="20"/>
+        </w:rPr>
+      </w:pPr>
+    </w:p>
+    <w:p>
+      <w:pPr>
+        <w:ind w:firstLineChars="100" w:firstLine="200"/>
+        <w:rPr>
+          <w:sz w:val="20"/>
+          <w:szCs w:val="20"/>
+        </w:rPr>
+      </w:pPr>
+    </w:p>
+    <w:p>
+      <w:pPr>
+        <w:rPr>
+          <w:sz w:val="20"/>
+          <w:szCs w:val="20"/>
+        </w:rPr>
+      </w:pPr>
+    </w:p>
+    <w:p>
+      <w:pPr>
+        <w:rPr>
+          <w:sz w:val="20"/>
+          <w:szCs w:val="20"/>
+        </w:rPr>
+      </w:pPr>
+    </w:p>
+    <w:p>
+      <w:pPr>
+        <w:rPr>
           <w:sz w:val="20"/>
           <w:szCs w:val="20"/>
         </w:rPr>
@@ -14937,7 +15192,6 @@
       <w:pPr>
         <w:jc w:val="center"/>
         <w:rPr>
-          <w:rFonts w:hint="eastAsia"/>
           <w:b/>
           <w:bCs/>
           <w:szCs w:val="22"/>
@@ -14950,23 +15204,53 @@
           <w:bCs/>
           <w:szCs w:val="22"/>
         </w:rPr>
-        <w:t>5. 결론</w:t>
-      </w:r>
-    </w:p>
-    <w:p>
-      <w:pPr>
-        <w:ind w:firstLineChars="100" w:firstLine="200"/>
-        <w:rPr>
-          <w:sz w:val="20"/>
-          <w:szCs w:val="20"/>
-        </w:rPr>
-      </w:pPr>
-      <w:r>
-        <w:rPr>
-          <w:sz w:val="20"/>
-          <w:szCs w:val="20"/>
-        </w:rPr>
-        <w:t xml:space="preserve">본 연구에서는 </w:t>
+        <w:t>참고문헌</w:t>
+      </w:r>
+    </w:p>
+    <w:p>
+      <w:pPr>
+        <w:rPr>
+          <w:sz w:val="20"/>
+          <w:szCs w:val="20"/>
+        </w:rPr>
+      </w:pPr>
+      <w:r>
+        <w:rPr>
+          <w:sz w:val="20"/>
+          <w:szCs w:val="20"/>
+        </w:rPr>
+        <w:t>[1] UAM Team Korea. (2025). 한국형 도심항공교통(K-UAM) 운용개념서 1.5. UAM Team Korea.</w:t>
+      </w:r>
+    </w:p>
+    <w:p>
+      <w:pPr>
+        <w:rPr>
+          <w:sz w:val="20"/>
+          <w:szCs w:val="20"/>
+        </w:rPr>
+      </w:pPr>
+    </w:p>
+    <w:p>
+      <w:pPr>
+        <w:rPr>
+          <w:sz w:val="20"/>
+          <w:szCs w:val="20"/>
+        </w:rPr>
+      </w:pPr>
+      <w:r>
+        <w:rPr>
+          <w:rFonts w:hint="eastAsia"/>
+          <w:sz w:val="20"/>
+          <w:szCs w:val="20"/>
+        </w:rPr>
+        <w:t xml:space="preserve">[2] </w:t>
+      </w:r>
+      <w:r>
+        <w:rPr>
+          <w:sz w:val="20"/>
+          <w:szCs w:val="20"/>
+        </w:rPr>
+        <w:t xml:space="preserve">조동현. (2025, 7월 30일). ‘서울 쏠림’ ‘지도 부재’ 해결해야 [新내수 시장 더 키우려면]. </w:t>
       </w:r>
       <w:proofErr w:type="spellStart"/>
       <w:r>
@@ -14974,7 +15258,7 @@
           <w:sz w:val="20"/>
           <w:szCs w:val="20"/>
         </w:rPr>
-        <w:t>버티포트</w:t>
+        <w:t>매경이코노미</w:t>
       </w:r>
       <w:proofErr w:type="spellEnd"/>
       <w:r>
@@ -14982,346 +15266,9 @@
           <w:sz w:val="20"/>
           <w:szCs w:val="20"/>
         </w:rPr>
-        <w:t xml:space="preserve"> 후보지와 VRP 기반 경로 최적화 결과를 바탕으로 UAM 노선의 공간적 특성을 분석하였다. 분석 결과, 대부분의 조건에서 유사한 경로가 도출되는 것을 확인할 수 있었다. 이는 선정된 </w:t>
-      </w:r>
-      <w:proofErr w:type="spellStart"/>
-      <w:r>
-        <w:rPr>
-          <w:sz w:val="20"/>
-          <w:szCs w:val="20"/>
-        </w:rPr>
-        <w:t>버티포트</w:t>
-      </w:r>
-      <w:proofErr w:type="spellEnd"/>
-      <w:r>
-        <w:rPr>
-          <w:sz w:val="20"/>
-          <w:szCs w:val="20"/>
-        </w:rPr>
-        <w:t xml:space="preserve"> 후보지 간의 공간적 배치와 비용 조건이 경로 형성에 일정한 영향을 미치고 있음을 보여준다.</w:t>
-      </w:r>
-    </w:p>
-    <w:p>
-      <w:pPr>
-        <w:ind w:firstLineChars="100" w:firstLine="200"/>
-        <w:rPr>
-          <w:sz w:val="20"/>
-          <w:szCs w:val="20"/>
-        </w:rPr>
-      </w:pPr>
-      <w:r>
-        <w:rPr>
-          <w:sz w:val="20"/>
-          <w:szCs w:val="20"/>
-        </w:rPr>
-        <w:t xml:space="preserve">그러나 본 연구에서 도출된 경로는 아직 안전성 요건을 충분히 반영하지 못했다는 한계가 있다. 또한 VRP 적용 과정과 </w:t>
-      </w:r>
-      <w:proofErr w:type="spellStart"/>
-      <w:r>
-        <w:rPr>
-          <w:sz w:val="20"/>
-          <w:szCs w:val="20"/>
-        </w:rPr>
-        <w:t>버티포트</w:t>
-      </w:r>
-      <w:proofErr w:type="spellEnd"/>
-      <w:r>
-        <w:rPr>
-          <w:sz w:val="20"/>
-          <w:szCs w:val="20"/>
-        </w:rPr>
-        <w:t xml:space="preserve"> </w:t>
-      </w:r>
-      <w:r>
-        <w:rPr>
-          <w:sz w:val="20"/>
-          <w:szCs w:val="20"/>
-        </w:rPr>
-        <w:t>수요 분석에서 사용된 가중치는 탐색적 가정에 기반하여 설정되었기 때문에, 결과의 신뢰성을 높이기 위해서는 보다 객관적인 근거가 필요하다.</w:t>
-      </w:r>
-    </w:p>
-    <w:p>
-      <w:pPr>
-        <w:ind w:firstLineChars="100" w:firstLine="200"/>
-        <w:rPr>
-          <w:sz w:val="20"/>
-          <w:szCs w:val="20"/>
-        </w:rPr>
-      </w:pPr>
-      <w:r>
-        <w:rPr>
-          <w:sz w:val="20"/>
-          <w:szCs w:val="20"/>
-        </w:rPr>
-        <w:t>따라서 향후 연구에서는 CBS 알고리즘 등 다중 경로 충돌 회피 기법을 활용하여 UAM 항로의 안전성을 검토할 필요가 있다. 또한 실제 수요 자료, 관광</w:t>
-      </w:r>
-      <w:r>
-        <w:rPr>
-          <w:rFonts w:hint="eastAsia"/>
-          <w:sz w:val="20"/>
-          <w:szCs w:val="20"/>
-        </w:rPr>
-        <w:t xml:space="preserve">, </w:t>
-      </w:r>
-      <w:r>
-        <w:rPr>
-          <w:sz w:val="20"/>
-          <w:szCs w:val="20"/>
-        </w:rPr>
-        <w:t>업무</w:t>
-      </w:r>
-      <w:r>
-        <w:rPr>
-          <w:rFonts w:hint="eastAsia"/>
-          <w:sz w:val="20"/>
-          <w:szCs w:val="20"/>
-        </w:rPr>
-        <w:t xml:space="preserve">, </w:t>
-      </w:r>
-      <w:r>
-        <w:rPr>
-          <w:sz w:val="20"/>
-          <w:szCs w:val="20"/>
-        </w:rPr>
-        <w:t>교통 데이터 등 보다 다양한 데이터를 추가적으로 확보하여 가중치 산정의 객관성을 높이고, 이를 통해 보다 현실성 있는 UAM 경로 선정 방안을 제시하고자 한다.</w:t>
-      </w:r>
-    </w:p>
-    <w:p>
-      <w:pPr>
-        <w:ind w:firstLineChars="100" w:firstLine="200"/>
-        <w:rPr>
-          <w:sz w:val="20"/>
-          <w:szCs w:val="20"/>
-        </w:rPr>
-      </w:pPr>
-    </w:p>
-    <w:p>
-      <w:pPr>
-        <w:ind w:firstLineChars="100" w:firstLine="200"/>
-        <w:rPr>
-          <w:sz w:val="20"/>
-          <w:szCs w:val="20"/>
-        </w:rPr>
-      </w:pPr>
-    </w:p>
-    <w:p>
-      <w:pPr>
-        <w:ind w:firstLineChars="100" w:firstLine="200"/>
-        <w:rPr>
-          <w:sz w:val="20"/>
-          <w:szCs w:val="20"/>
-        </w:rPr>
-      </w:pPr>
-    </w:p>
-    <w:p>
-      <w:pPr>
-        <w:ind w:firstLineChars="100" w:firstLine="200"/>
-        <w:rPr>
-          <w:sz w:val="20"/>
-          <w:szCs w:val="20"/>
-        </w:rPr>
-      </w:pPr>
-    </w:p>
-    <w:p>
-      <w:pPr>
-        <w:ind w:firstLineChars="100" w:firstLine="200"/>
-        <w:rPr>
-          <w:sz w:val="20"/>
-          <w:szCs w:val="20"/>
-        </w:rPr>
-      </w:pPr>
-    </w:p>
-    <w:p>
-      <w:pPr>
-        <w:ind w:firstLineChars="100" w:firstLine="200"/>
-        <w:rPr>
-          <w:sz w:val="20"/>
-          <w:szCs w:val="20"/>
-        </w:rPr>
-      </w:pPr>
-    </w:p>
-    <w:p>
-      <w:pPr>
-        <w:ind w:firstLineChars="100" w:firstLine="200"/>
-        <w:rPr>
-          <w:sz w:val="20"/>
-          <w:szCs w:val="20"/>
-        </w:rPr>
-      </w:pPr>
-    </w:p>
-    <w:p>
-      <w:pPr>
-        <w:ind w:firstLineChars="100" w:firstLine="200"/>
-        <w:rPr>
-          <w:sz w:val="20"/>
-          <w:szCs w:val="20"/>
-        </w:rPr>
-      </w:pPr>
-    </w:p>
-    <w:p>
-      <w:pPr>
-        <w:ind w:firstLineChars="100" w:firstLine="200"/>
-        <w:rPr>
-          <w:sz w:val="20"/>
-          <w:szCs w:val="20"/>
-        </w:rPr>
-      </w:pPr>
-    </w:p>
-    <w:p>
-      <w:pPr>
-        <w:rPr>
-          <w:sz w:val="20"/>
-          <w:szCs w:val="20"/>
-        </w:rPr>
-      </w:pPr>
-    </w:p>
-    <w:p>
-      <w:pPr>
-        <w:rPr>
-          <w:sz w:val="20"/>
-          <w:szCs w:val="20"/>
-        </w:rPr>
-      </w:pPr>
-    </w:p>
-    <w:p>
-      <w:pPr>
-        <w:rPr>
-          <w:sz w:val="20"/>
-          <w:szCs w:val="20"/>
-        </w:rPr>
-      </w:pPr>
-    </w:p>
-    <w:p>
-      <w:pPr>
-        <w:rPr>
-          <w:sz w:val="20"/>
-          <w:szCs w:val="20"/>
-        </w:rPr>
-      </w:pPr>
-    </w:p>
-    <w:p>
-      <w:pPr>
-        <w:rPr>
-          <w:sz w:val="20"/>
-          <w:szCs w:val="20"/>
-        </w:rPr>
-      </w:pPr>
-    </w:p>
-    <w:p>
-      <w:pPr>
-        <w:rPr>
-          <w:sz w:val="20"/>
-          <w:szCs w:val="20"/>
-        </w:rPr>
-      </w:pPr>
-    </w:p>
-    <w:p>
-      <w:pPr>
-        <w:rPr>
-          <w:sz w:val="20"/>
-          <w:szCs w:val="20"/>
-        </w:rPr>
-      </w:pPr>
-    </w:p>
-    <w:p>
-      <w:pPr>
-        <w:rPr>
-          <w:sz w:val="20"/>
-          <w:szCs w:val="20"/>
-        </w:rPr>
-      </w:pPr>
-    </w:p>
-    <w:p>
-      <w:pPr>
-        <w:rPr>
-          <w:sz w:val="20"/>
-          <w:szCs w:val="20"/>
-        </w:rPr>
-      </w:pPr>
-    </w:p>
-    <w:p>
-      <w:pPr>
-        <w:jc w:val="center"/>
-        <w:rPr>
-          <w:rFonts w:hint="eastAsia"/>
-          <w:b/>
-          <w:bCs/>
-          <w:szCs w:val="22"/>
-        </w:rPr>
-      </w:pPr>
-      <w:r>
-        <w:rPr>
-          <w:rFonts w:hint="eastAsia"/>
-          <w:b/>
-          <w:bCs/>
-          <w:szCs w:val="22"/>
-        </w:rPr>
-        <w:lastRenderedPageBreak/>
-        <w:t>참고문헌</w:t>
-      </w:r>
-    </w:p>
-    <w:p>
-      <w:pPr>
-        <w:rPr>
-          <w:sz w:val="20"/>
-          <w:szCs w:val="20"/>
-        </w:rPr>
-      </w:pPr>
-      <w:r>
-        <w:rPr>
-          <w:sz w:val="20"/>
-          <w:szCs w:val="20"/>
-        </w:rPr>
-        <w:t>[1] UAM Team Korea. (2025). 한국형 도심항공교통(K-UAM) 운용개념서 1.5. UAM Team Korea.</w:t>
-      </w:r>
-    </w:p>
-    <w:p>
-      <w:pPr>
-        <w:rPr>
-          <w:sz w:val="20"/>
-          <w:szCs w:val="20"/>
-        </w:rPr>
-      </w:pPr>
-    </w:p>
-    <w:p>
-      <w:pPr>
-        <w:rPr>
-          <w:sz w:val="20"/>
-          <w:szCs w:val="20"/>
-        </w:rPr>
-      </w:pPr>
-      <w:r>
-        <w:rPr>
-          <w:rFonts w:hint="eastAsia"/>
-          <w:sz w:val="20"/>
-          <w:szCs w:val="20"/>
-        </w:rPr>
-        <w:t xml:space="preserve">[2] </w:t>
-      </w:r>
-      <w:r>
-        <w:rPr>
-          <w:sz w:val="20"/>
-          <w:szCs w:val="20"/>
-        </w:rPr>
-        <w:t xml:space="preserve">조동현. (2025, 7월 30일). ‘서울 쏠림’ ‘지도 부재’ 해결해야 [新내수 시장 더 키우려면]. </w:t>
-      </w:r>
-      <w:proofErr w:type="spellStart"/>
-      <w:r>
-        <w:rPr>
-          <w:sz w:val="20"/>
-          <w:szCs w:val="20"/>
-        </w:rPr>
-        <w:t>매경이코노미</w:t>
-      </w:r>
-      <w:proofErr w:type="spellEnd"/>
-      <w:r>
-        <w:rPr>
-          <w:sz w:val="20"/>
-          <w:szCs w:val="20"/>
-        </w:rPr>
         <w:t xml:space="preserve">. </w:t>
       </w:r>
-      <w:hyperlink r:id="rId29" w:history="1">
+      <w:hyperlink r:id="rId30" w:history="1">
         <w:r>
           <w:rPr>
             <w:rStyle w:val="af"/>
@@ -15441,7 +15388,7 @@
         </w:rPr>
         <w:t xml:space="preserve">[4] Scholz, D. (n.d.). 14 design evaluation / DOC. Hamburg Open Online University. </w:t>
       </w:r>
-      <w:hyperlink r:id="rId30" w:history="1">
+      <w:hyperlink r:id="rId31" w:history="1">
         <w:r>
           <w:rPr>
             <w:rStyle w:val="af"/>
@@ -15463,17 +15410,23 @@
     <w:p>
       <w:pPr>
         <w:rPr>
-          <w:rFonts w:hint="eastAsia"/>
-          <w:sz w:val="20"/>
-          <w:szCs w:val="20"/>
-        </w:rPr>
-      </w:pPr>
-      <w:r>
-        <w:rPr>
-          <w:sz w:val="20"/>
-          <w:szCs w:val="20"/>
-        </w:rPr>
-        <w:t>[5] 김상규, &amp; 이진우. (2021, 11월 10–11일). 도시레벨 UAM 운영의 경제성 검증을 위한 초기 일반화 비용모델 제시 [학술대회 발표자료]. 대한교통학회 제85회 학술발표회, 587–588.</w:t>
+          <w:sz w:val="20"/>
+          <w:szCs w:val="20"/>
+        </w:rPr>
+      </w:pPr>
+      <w:r>
+        <w:rPr>
+          <w:sz w:val="20"/>
+          <w:szCs w:val="20"/>
+        </w:rPr>
+        <w:t xml:space="preserve">[5] 김상규, &amp; 이진우. (2021, 11월 10–11일). 도시레벨 UAM 운영의 경제성 검증을 위한 </w:t>
+      </w:r>
+      <w:r>
+        <w:rPr>
+          <w:sz w:val="20"/>
+          <w:szCs w:val="20"/>
+        </w:rPr>
+        <w:t>초기 일반화 비용모델 제시 [학술대회 발표자료]. 대한교통학회 제85회 학술발표회, 587–588.</w:t>
       </w:r>
     </w:p>
     <w:sectPr>
@@ -16204,6 +16157,119 @@
       </w:pPr>
     </w:lvl>
   </w:abstractNum>
+  <w:abstractNum w:abstractNumId="6" w15:restartNumberingAfterBreak="0">
+    <w:nsid w:val="60317380"/>
+    <w:multiLevelType w:val="multilevel"/>
+    <w:tmpl w:val="ABE04628"/>
+    <w:lvl w:ilvl="0">
+      <w:start w:val="5"/>
+      <w:numFmt w:val="decimal"/>
+      <w:lvlText w:val="%1."/>
+      <w:lvlJc w:val="left"/>
+      <w:pPr>
+        <w:tabs>
+          <w:tab w:val="num" w:pos="720"/>
+        </w:tabs>
+        <w:ind w:left="720" w:hanging="360"/>
+      </w:pPr>
+    </w:lvl>
+    <w:lvl w:ilvl="1" w:tentative="1">
+      <w:start w:val="1"/>
+      <w:numFmt w:val="decimal"/>
+      <w:lvlText w:val="%2."/>
+      <w:lvlJc w:val="left"/>
+      <w:pPr>
+        <w:tabs>
+          <w:tab w:val="num" w:pos="1440"/>
+        </w:tabs>
+        <w:ind w:left="1440" w:hanging="360"/>
+      </w:pPr>
+    </w:lvl>
+    <w:lvl w:ilvl="2" w:tentative="1">
+      <w:start w:val="1"/>
+      <w:numFmt w:val="decimal"/>
+      <w:lvlText w:val="%3."/>
+      <w:lvlJc w:val="left"/>
+      <w:pPr>
+        <w:tabs>
+          <w:tab w:val="num" w:pos="2160"/>
+        </w:tabs>
+        <w:ind w:left="2160" w:hanging="360"/>
+      </w:pPr>
+    </w:lvl>
+    <w:lvl w:ilvl="3" w:tentative="1">
+      <w:start w:val="1"/>
+      <w:numFmt w:val="decimal"/>
+      <w:lvlText w:val="%4."/>
+      <w:lvlJc w:val="left"/>
+      <w:pPr>
+        <w:tabs>
+          <w:tab w:val="num" w:pos="2880"/>
+        </w:tabs>
+        <w:ind w:left="2880" w:hanging="360"/>
+      </w:pPr>
+    </w:lvl>
+    <w:lvl w:ilvl="4" w:tentative="1">
+      <w:start w:val="1"/>
+      <w:numFmt w:val="decimal"/>
+      <w:lvlText w:val="%5."/>
+      <w:lvlJc w:val="left"/>
+      <w:pPr>
+        <w:tabs>
+          <w:tab w:val="num" w:pos="3600"/>
+        </w:tabs>
+        <w:ind w:left="3600" w:hanging="360"/>
+      </w:pPr>
+    </w:lvl>
+    <w:lvl w:ilvl="5" w:tentative="1">
+      <w:start w:val="1"/>
+      <w:numFmt w:val="decimal"/>
+      <w:lvlText w:val="%6."/>
+      <w:lvlJc w:val="left"/>
+      <w:pPr>
+        <w:tabs>
+          <w:tab w:val="num" w:pos="4320"/>
+        </w:tabs>
+        <w:ind w:left="4320" w:hanging="360"/>
+      </w:pPr>
+    </w:lvl>
+    <w:lvl w:ilvl="6" w:tentative="1">
+      <w:start w:val="1"/>
+      <w:numFmt w:val="decimal"/>
+      <w:lvlText w:val="%7."/>
+      <w:lvlJc w:val="left"/>
+      <w:pPr>
+        <w:tabs>
+          <w:tab w:val="num" w:pos="5040"/>
+        </w:tabs>
+        <w:ind w:left="5040" w:hanging="360"/>
+      </w:pPr>
+    </w:lvl>
+    <w:lvl w:ilvl="7" w:tentative="1">
+      <w:start w:val="1"/>
+      <w:numFmt w:val="decimal"/>
+      <w:lvlText w:val="%8."/>
+      <w:lvlJc w:val="left"/>
+      <w:pPr>
+        <w:tabs>
+          <w:tab w:val="num" w:pos="5760"/>
+        </w:tabs>
+        <w:ind w:left="5760" w:hanging="360"/>
+      </w:pPr>
+    </w:lvl>
+    <w:lvl w:ilvl="8" w:tentative="1">
+      <w:start w:val="1"/>
+      <w:numFmt w:val="decimal"/>
+      <w:lvlText w:val="%9."/>
+      <w:lvlJc w:val="left"/>
+      <w:pPr>
+        <w:tabs>
+          <w:tab w:val="num" w:pos="6480"/>
+        </w:tabs>
+        <w:ind w:left="6480" w:hanging="360"/>
+      </w:pPr>
+    </w:lvl>
+  </w:abstractNum>
   <w:num w:numId="1" w16cid:durableId="396173738">
     <w:abstractNumId w:val="4"/>
   </w:num>
@@ -16221,6 +16287,9 @@
   </w:num>
   <w:num w:numId="6" w16cid:durableId="815561521">
     <w:abstractNumId w:val="1"/>
+  </w:num>
+  <w:num w:numId="7" w16cid:durableId="1593315555">
+    <w:abstractNumId w:val="6"/>
   </w:num>
 </w:numbering>
 </file>
@@ -17569,4 +17638,16 @@
     </a:ext>
   </a:extLst>
 </a:theme>
+</file>
+
+<file path=customXml/item1.xml><?xml version="1.0" encoding="utf-8"?>
+<b:Sources xmlns:b="http://schemas.openxmlformats.org/officeDocument/2006/bibliography" xmlns="http://schemas.openxmlformats.org/officeDocument/2006/bibliography" SelectedStyle="\APASixthEditionOfficeOnline.xsl" StyleName="APA" Version="6"/>
+</file>
+
+<file path=customXml/itemProps1.xml><?xml version="1.0" encoding="utf-8"?>
+<ds:datastoreItem xmlns:ds="http://schemas.openxmlformats.org/officeDocument/2006/customXml" ds:itemID="{0E027529-2299-46F4-BD37-3DA23AD4A26C}">
+  <ds:schemaRefs>
+    <ds:schemaRef ds:uri="http://schemas.openxmlformats.org/officeDocument/2006/bibliography"/>
+  </ds:schemaRefs>
+</ds:datastoreItem>
 </file>
</xml_diff>